<commit_message>
adjustments to the calculation and document
</commit_message>
<xml_diff>
--- a/DECLARAÇÃO_DE_MARGEM_MODELO.docx
+++ b/DECLARAÇÃO_DE_MARGEM_MODELO.docx
@@ -87,6 +87,8 @@
         <w:jc w:val="both"/>
         <w:rPr>
           <w:rFonts w:ascii="Arial" w:hAnsi="Arial" w:cs="Arial"/>
+          <w:b/>
+          <w:bCs/>
           <w:color w:val="000000"/>
           <w:sz w:val="24"/>
           <w:szCs w:val="24"/>
@@ -165,7 +167,7 @@
           <w:sz w:val="24"/>
           <w:szCs w:val="24"/>
         </w:rPr>
-        <w:t>XXXX</w:t>
+        <w:t>{{NOME}}</w:t>
       </w:r>
       <w:r>
         <w:rPr>
@@ -199,7 +201,27 @@
           <w:sz w:val="24"/>
           <w:szCs w:val="24"/>
         </w:rPr>
-        <w:t>XXXX</w:t>
+        <w:t>{{</w:t>
+      </w:r>
+      <w:proofErr w:type="gramStart"/>
+      <w:r>
+        <w:rPr>
+          <w:rFonts w:ascii="Arial" w:eastAsia="Arial Unicode MS" w:hAnsi="Arial" w:cs="Arial"/>
+          <w:b/>
+          <w:sz w:val="24"/>
+          <w:szCs w:val="24"/>
+        </w:rPr>
+        <w:t>MATRICULA</w:t>
+      </w:r>
+      <w:proofErr w:type="gramEnd"/>
+      <w:r>
+        <w:rPr>
+          <w:rFonts w:ascii="Arial" w:eastAsia="Arial Unicode MS" w:hAnsi="Arial" w:cs="Arial"/>
+          <w:b/>
+          <w:sz w:val="24"/>
+          <w:szCs w:val="24"/>
+        </w:rPr>
+        <w:t>}}</w:t>
       </w:r>
       <w:r>
         <w:rPr>
@@ -225,7 +247,7 @@
           <w:sz w:val="24"/>
           <w:szCs w:val="24"/>
         </w:rPr>
-        <w:t>XXXX</w:t>
+        <w:t>{{CPF}}</w:t>
       </w:r>
       <w:r>
         <w:rPr>
@@ -242,24 +264,44 @@
           <w:sz w:val="24"/>
           <w:szCs w:val="24"/>
         </w:rPr>
-        <w:t>APOSENTADA</w:t>
-      </w:r>
-      <w:r>
-        <w:rPr>
-          <w:rFonts w:ascii="Arial" w:eastAsia="Arial Unicode MS" w:hAnsi="Arial" w:cs="Arial"/>
-          <w:b/>
-          <w:sz w:val="24"/>
-          <w:szCs w:val="24"/>
-        </w:rPr>
-        <w:t xml:space="preserve"> OU PENSIONISTA</w:t>
-      </w:r>
-      <w:r>
-        <w:rPr>
-          <w:rFonts w:ascii="Arial" w:eastAsia="Arial Unicode MS" w:hAnsi="Arial" w:cs="Arial"/>
-          <w:sz w:val="24"/>
-          <w:szCs w:val="24"/>
-        </w:rPr>
-        <w:t xml:space="preserve"> deste município recebendo atualmente uma remuneração </w:t>
+        <w:t>{{</w:t>
+      </w:r>
+      <w:proofErr w:type="gramStart"/>
+      <w:r>
+        <w:rPr>
+          <w:rFonts w:ascii="Arial" w:eastAsia="Arial Unicode MS" w:hAnsi="Arial" w:cs="Arial"/>
+          <w:b/>
+          <w:sz w:val="24"/>
+          <w:szCs w:val="24"/>
+        </w:rPr>
+        <w:t>VINCULO</w:t>
+      </w:r>
+      <w:proofErr w:type="gramEnd"/>
+      <w:r>
+        <w:rPr>
+          <w:rFonts w:ascii="Arial" w:eastAsia="Arial Unicode MS" w:hAnsi="Arial" w:cs="Arial"/>
+          <w:b/>
+          <w:sz w:val="24"/>
+          <w:szCs w:val="24"/>
+        </w:rPr>
+        <w:t>}}</w:t>
+      </w:r>
+      <w:r>
+        <w:rPr>
+          <w:rFonts w:ascii="Arial" w:eastAsia="Arial Unicode MS" w:hAnsi="Arial" w:cs="Arial"/>
+          <w:b/>
+          <w:sz w:val="24"/>
+          <w:szCs w:val="24"/>
+        </w:rPr>
+        <w:t xml:space="preserve"> </w:t>
+      </w:r>
+      <w:r>
+        <w:rPr>
+          <w:rFonts w:ascii="Arial" w:eastAsia="Arial Unicode MS" w:hAnsi="Arial" w:cs="Arial"/>
+          <w:sz w:val="24"/>
+          <w:szCs w:val="24"/>
+        </w:rPr>
+        <w:t xml:space="preserve">deste município recebendo atualmente uma remuneração </w:t>
       </w:r>
       <w:r>
         <w:rPr>
@@ -280,7 +322,27 @@
           <w:sz w:val="24"/>
           <w:szCs w:val="24"/>
         </w:rPr>
-        <w:t>XXXX</w:t>
+        <w:t>{{</w:t>
+      </w:r>
+      <w:proofErr w:type="gramStart"/>
+      <w:r>
+        <w:rPr>
+          <w:rFonts w:ascii="Arial" w:eastAsia="Arial Unicode MS" w:hAnsi="Arial" w:cs="Arial"/>
+          <w:b/>
+          <w:sz w:val="24"/>
+          <w:szCs w:val="24"/>
+        </w:rPr>
+        <w:t>SALARIO</w:t>
+      </w:r>
+      <w:proofErr w:type="gramEnd"/>
+      <w:r>
+        <w:rPr>
+          <w:rFonts w:ascii="Arial" w:eastAsia="Arial Unicode MS" w:hAnsi="Arial" w:cs="Arial"/>
+          <w:b/>
+          <w:sz w:val="24"/>
+          <w:szCs w:val="24"/>
+        </w:rPr>
+        <w:t>_NUM}}</w:t>
       </w:r>
       <w:r>
         <w:rPr>
@@ -305,7 +367,25 @@
           <w:sz w:val="24"/>
           <w:szCs w:val="24"/>
         </w:rPr>
-        <w:t>ESCREVE VALOR EM EXTENSO</w:t>
+        <w:t>{{</w:t>
+      </w:r>
+      <w:proofErr w:type="gramStart"/>
+      <w:r>
+        <w:rPr>
+          <w:rFonts w:ascii="Arial" w:eastAsia="Arial Unicode MS" w:hAnsi="Arial" w:cs="Arial"/>
+          <w:sz w:val="24"/>
+          <w:szCs w:val="24"/>
+        </w:rPr>
+        <w:t>SALARIO</w:t>
+      </w:r>
+      <w:proofErr w:type="gramEnd"/>
+      <w:r>
+        <w:rPr>
+          <w:rFonts w:ascii="Arial" w:eastAsia="Arial Unicode MS" w:hAnsi="Arial" w:cs="Arial"/>
+          <w:sz w:val="24"/>
+          <w:szCs w:val="24"/>
+        </w:rPr>
+        <w:t>_EXT}}</w:t>
       </w:r>
       <w:r>
         <w:rPr>
@@ -391,7 +471,7 @@
           <w:sz w:val="24"/>
           <w:szCs w:val="24"/>
         </w:rPr>
-        <w:t>XXXXX</w:t>
+        <w:t>{{MARGEM_TOTAL_NUM}}</w:t>
       </w:r>
       <w:r>
         <w:rPr>
@@ -420,16 +500,7 @@
           <w:sz w:val="24"/>
           <w:szCs w:val="24"/>
         </w:rPr>
-        <w:t>ESCREVE VALOR POR EXTENSO</w:t>
-      </w:r>
-      <w:r>
-        <w:rPr>
-          <w:rFonts w:ascii="Arial" w:hAnsi="Arial" w:cs="Arial"/>
-          <w:color w:val="000000"/>
-          <w:sz w:val="24"/>
-          <w:szCs w:val="24"/>
-        </w:rPr>
-        <w:t>.</w:t>
+        <w:t>{{MARGEM_TOTAL_EXT}}</w:t>
       </w:r>
       <w:r>
         <w:rPr>
@@ -447,7 +518,34 @@
           <w:sz w:val="24"/>
           <w:szCs w:val="24"/>
         </w:rPr>
-        <w:t xml:space="preserve">Comprometida em empréstimos no banco Bradesco S/A, totalizando um valor de </w:t>
+        <w:t>comprometida</w:t>
+      </w:r>
+      <w:r>
+        <w:rPr>
+          <w:rFonts w:ascii="Arial" w:hAnsi="Arial" w:cs="Arial"/>
+          <w:color w:val="000000"/>
+          <w:sz w:val="24"/>
+          <w:szCs w:val="24"/>
+        </w:rPr>
+        <w:t xml:space="preserve"> em empréstimos no banco Bradesco S/A, totalizando</w:t>
+      </w:r>
+      <w:r>
+        <w:rPr>
+          <w:rFonts w:ascii="Arial" w:hAnsi="Arial" w:cs="Arial"/>
+          <w:color w:val="000000"/>
+          <w:sz w:val="24"/>
+          <w:szCs w:val="24"/>
+        </w:rPr>
+        <w:t xml:space="preserve"> </w:t>
+      </w:r>
+      <w:r>
+        <w:rPr>
+          <w:rFonts w:ascii="Arial" w:hAnsi="Arial" w:cs="Arial"/>
+          <w:color w:val="000000"/>
+          <w:sz w:val="24"/>
+          <w:szCs w:val="24"/>
+        </w:rPr>
+        <w:t xml:space="preserve">um valor de </w:t>
       </w:r>
       <w:r>
         <w:rPr>
@@ -478,7 +576,7 @@
           <w:sz w:val="24"/>
           <w:szCs w:val="24"/>
         </w:rPr>
-        <w:t>XXXXX</w:t>
+        <w:t>{{MARGEM_COMPROMETIDA_NUM}}</w:t>
       </w:r>
       <w:r>
         <w:rPr>
@@ -507,16 +605,7 @@
           <w:sz w:val="24"/>
           <w:szCs w:val="24"/>
         </w:rPr>
-        <w:t>ESCREVE VALOR POR EXTENSO</w:t>
-      </w:r>
-      <w:r>
-        <w:rPr>
-          <w:rFonts w:ascii="Arial" w:hAnsi="Arial" w:cs="Arial"/>
-          <w:color w:val="000000"/>
-          <w:sz w:val="24"/>
-          <w:szCs w:val="24"/>
-        </w:rPr>
-        <w:t>.</w:t>
+        <w:t>{{MARGEM_COMPROMETIDA_EXT}}</w:t>
       </w:r>
       <w:r>
         <w:rPr>
@@ -592,57 +681,13 @@
           <w:sz w:val="24"/>
           <w:szCs w:val="24"/>
         </w:rPr>
-        <w:t>XXX</w:t>
-      </w:r>
-      <w:r>
-        <w:rPr>
-          <w:rFonts w:ascii="Arial" w:hAnsi="Arial" w:cs="Arial"/>
-          <w:color w:val="000000"/>
-          <w:sz w:val="24"/>
-          <w:szCs w:val="24"/>
-        </w:rPr>
-        <w:t xml:space="preserve"> </w:t>
-      </w:r>
-      <w:r>
-        <w:rPr>
-          <w:rFonts w:ascii="Arial" w:hAnsi="Arial" w:cs="Arial"/>
-          <w:color w:val="000000"/>
-          <w:sz w:val="24"/>
-          <w:szCs w:val="24"/>
-        </w:rPr>
-        <w:t>(</w:t>
-      </w:r>
-      <w:r>
-        <w:rPr>
-          <w:rFonts w:ascii="Arial" w:hAnsi="Arial" w:cs="Arial"/>
-          <w:color w:val="000000"/>
-          <w:sz w:val="24"/>
-          <w:szCs w:val="24"/>
-        </w:rPr>
-        <w:t>ESCREVE VALOR EM EXTENSO</w:t>
-      </w:r>
-      <w:r>
-        <w:rPr>
-          <w:rFonts w:ascii="Arial" w:hAnsi="Arial" w:cs="Arial"/>
-          <w:color w:val="000000"/>
-          <w:sz w:val="24"/>
-          <w:szCs w:val="24"/>
-        </w:rPr>
-        <w:t>)</w:t>
-      </w:r>
-      <w:r>
-        <w:rPr>
-          <w:rFonts w:ascii="Arial" w:hAnsi="Arial" w:cs="Arial"/>
-          <w:color w:val="000000"/>
-          <w:sz w:val="24"/>
-          <w:szCs w:val="24"/>
-        </w:rPr>
-        <w:t>.</w:t>
+        <w:t>{{MARGEM_LIVRE_NUM}} ({{MARGEM_LIVRE_EXT}}).</w:t>
       </w:r>
     </w:p>
     <w:p>
       <w:pPr>
         <w:spacing w:line="360" w:lineRule="auto"/>
+        <w:ind w:firstLine="709"/>
         <w:jc w:val="both"/>
         <w:rPr>
           <w:rFonts w:ascii="Arial" w:hAnsi="Arial" w:cs="Arial"/>
@@ -720,59 +765,7 @@
           <w:sz w:val="24"/>
           <w:szCs w:val="24"/>
         </w:rPr>
-        <w:t>DATA</w:t>
-      </w:r>
-      <w:r>
-        <w:rPr>
-          <w:rFonts w:ascii="Arial" w:eastAsia="Arial Unicode MS" w:hAnsi="Arial" w:cs="Arial"/>
-          <w:sz w:val="24"/>
-          <w:szCs w:val="24"/>
-        </w:rPr>
-        <w:t xml:space="preserve"> </w:t>
-      </w:r>
-      <w:r>
-        <w:rPr>
-          <w:rFonts w:ascii="Arial" w:eastAsia="Arial Unicode MS" w:hAnsi="Arial" w:cs="Arial"/>
-          <w:sz w:val="24"/>
-          <w:szCs w:val="24"/>
-        </w:rPr>
-        <w:t xml:space="preserve">de </w:t>
-      </w:r>
-      <w:r>
-        <w:rPr>
-          <w:rFonts w:ascii="Arial" w:eastAsia="Arial Unicode MS" w:hAnsi="Arial" w:cs="Arial"/>
-          <w:b/>
-          <w:bCs/>
-          <w:sz w:val="24"/>
-          <w:szCs w:val="24"/>
-        </w:rPr>
-        <w:t>MÊS</w:t>
-      </w:r>
-      <w:r>
-        <w:rPr>
-          <w:rFonts w:ascii="Arial" w:eastAsia="Arial Unicode MS" w:hAnsi="Arial" w:cs="Arial"/>
-          <w:sz w:val="24"/>
-          <w:szCs w:val="24"/>
-        </w:rPr>
-        <w:t xml:space="preserve"> </w:t>
-      </w:r>
-      <w:r>
-        <w:rPr>
-          <w:rFonts w:ascii="Arial" w:eastAsia="Arial Unicode MS" w:hAnsi="Arial" w:cs="Arial"/>
-          <w:sz w:val="24"/>
-          <w:szCs w:val="24"/>
-        </w:rPr>
-        <w:t xml:space="preserve">de </w:t>
-      </w:r>
-      <w:r>
-        <w:rPr>
-          <w:rFonts w:ascii="Arial" w:eastAsia="Arial Unicode MS" w:hAnsi="Arial" w:cs="Arial"/>
-          <w:b/>
-          <w:bCs/>
-          <w:sz w:val="24"/>
-          <w:szCs w:val="24"/>
-        </w:rPr>
-        <w:t>ANO</w:t>
+        <w:t>{{DATA}}</w:t>
       </w:r>
       <w:r>
         <w:rPr>

</xml_diff>

<commit_message>
project worked as expected - generating declaration correctly
</commit_message>
<xml_diff>
--- a/DECLARAÇÃO_DE_MARGEM_MODELO.docx
+++ b/DECLARAÇÃO_DE_MARGEM_MODELO.docx
@@ -97,70 +97,13 @@
           <w:sz w:val="24"/>
           <w:szCs w:val="24"/>
         </w:rPr>
-        <w:t xml:space="preserve">Declaramos para os devidos fins junto ao BANCO BRADESCO S/A </w:t>
-      </w:r>
-      <w:r>
-        <w:rPr>
-          <w:rFonts w:ascii="Arial" w:eastAsia="Arial Unicode MS" w:hAnsi="Arial" w:cs="Arial"/>
-          <w:b/>
-          <w:sz w:val="24"/>
-          <w:szCs w:val="24"/>
-        </w:rPr>
-        <w:t>Agência 1</w:t>
-      </w:r>
-      <w:r>
-        <w:rPr>
-          <w:rFonts w:ascii="Arial" w:eastAsia="Arial Unicode MS" w:hAnsi="Arial" w:cs="Arial"/>
-          <w:b/>
-          <w:sz w:val="24"/>
-          <w:szCs w:val="24"/>
-        </w:rPr>
-        <w:t>783-3</w:t>
-      </w:r>
-      <w:r>
-        <w:rPr>
-          <w:rFonts w:ascii="Arial" w:eastAsia="Arial Unicode MS" w:hAnsi="Arial" w:cs="Arial"/>
-          <w:sz w:val="24"/>
-          <w:szCs w:val="24"/>
-        </w:rPr>
-        <w:t xml:space="preserve"> Carpina-PE, que </w:t>
-      </w:r>
-      <w:r>
-        <w:rPr>
-          <w:rFonts w:ascii="Arial" w:eastAsia="Arial Unicode MS" w:hAnsi="Arial" w:cs="Arial"/>
-          <w:sz w:val="24"/>
-          <w:szCs w:val="24"/>
-        </w:rPr>
-        <w:t>a</w:t>
-      </w:r>
-      <w:r>
-        <w:rPr>
-          <w:rFonts w:ascii="Arial" w:eastAsia="Arial Unicode MS" w:hAnsi="Arial" w:cs="Arial"/>
-          <w:sz w:val="24"/>
-          <w:szCs w:val="24"/>
-        </w:rPr>
-        <w:t xml:space="preserve"> Sr</w:t>
-      </w:r>
-      <w:r>
-        <w:rPr>
-          <w:rFonts w:ascii="Arial" w:eastAsia="Arial Unicode MS" w:hAnsi="Arial" w:cs="Arial"/>
-          <w:sz w:val="24"/>
-          <w:szCs w:val="24"/>
-        </w:rPr>
-        <w:t>a</w:t>
-      </w:r>
-      <w:r>
-        <w:rPr>
-          <w:rFonts w:ascii="Arial" w:eastAsia="Arial Unicode MS" w:hAnsi="Arial" w:cs="Arial"/>
-          <w:sz w:val="24"/>
-          <w:szCs w:val="24"/>
-        </w:rPr>
-        <w:t xml:space="preserve">. </w:t>
-      </w:r>
-      <w:r>
-        <w:rPr>
-          <w:rFonts w:ascii="Arial" w:eastAsia="Arial Unicode MS" w:hAnsi="Arial" w:cs="Arial"/>
-          <w:b/>
+        <w:t xml:space="preserve">Declaramos para os devidos fins junto ao BANCO BRADESCO S/A Agência 1783-3 Carpina-PE, que a Sra. </w:t>
+      </w:r>
+      <w:r>
+        <w:rPr>
+          <w:rFonts w:ascii="Arial" w:eastAsia="Arial Unicode MS" w:hAnsi="Arial" w:cs="Arial"/>
+          <w:b/>
+          <w:bCs/>
           <w:sz w:val="24"/>
           <w:szCs w:val="24"/>
         </w:rPr>
@@ -169,41 +112,27 @@
       <w:r>
         <w:rPr>
           <w:rFonts w:ascii="Arial" w:eastAsia="Arial Unicode MS" w:hAnsi="Arial" w:cs="Arial"/>
-          <w:b/>
-          <w:sz w:val="24"/>
-          <w:szCs w:val="24"/>
-        </w:rPr>
-        <w:t xml:space="preserve">, </w:t>
-      </w:r>
-      <w:r>
-        <w:rPr>
-          <w:rFonts w:ascii="Arial" w:eastAsia="Arial Unicode MS" w:hAnsi="Arial" w:cs="Arial"/>
-          <w:sz w:val="24"/>
-          <w:szCs w:val="24"/>
-        </w:rPr>
-        <w:t>Matrícula</w:t>
-      </w:r>
-      <w:r>
-        <w:rPr>
-          <w:rFonts w:ascii="Arial" w:eastAsia="Arial Unicode MS" w:hAnsi="Arial" w:cs="Arial"/>
-          <w:sz w:val="24"/>
-          <w:szCs w:val="24"/>
-        </w:rPr>
-        <w:t xml:space="preserve"> n° </w:t>
-      </w:r>
-      <w:r>
-        <w:rPr>
-          <w:rFonts w:ascii="Arial" w:eastAsia="Arial Unicode MS" w:hAnsi="Arial" w:cs="Arial"/>
-          <w:b/>
+          <w:sz w:val="24"/>
+          <w:szCs w:val="24"/>
+        </w:rPr>
+        <w:t xml:space="preserve">, Matrícula n° </w:t>
+      </w:r>
+      <w:r>
+        <w:rPr>
+          <w:rFonts w:ascii="Arial" w:eastAsia="Arial Unicode MS" w:hAnsi="Arial" w:cs="Arial"/>
+          <w:b/>
+          <w:bCs/>
           <w:sz w:val="24"/>
           <w:szCs w:val="24"/>
         </w:rPr>
         <w:t>{{</w:t>
       </w:r>
-      <w:r>
-        <w:rPr>
-          <w:rFonts w:ascii="Arial" w:eastAsia="Arial Unicode MS" w:hAnsi="Arial" w:cs="Arial"/>
-          <w:b/>
+      <w:proofErr w:type="gramStart"/>
+      <w:r>
+        <w:rPr>
+          <w:rFonts w:ascii="Arial" w:eastAsia="Arial Unicode MS" w:hAnsi="Arial" w:cs="Arial"/>
+          <w:b/>
+          <w:bCs/>
           <w:sz w:val="24"/>
           <w:szCs w:val="24"/>
         </w:rPr>
@@ -213,6 +142,7 @@
         <w:rPr>
           <w:rFonts w:ascii="Arial" w:eastAsia="Arial Unicode MS" w:hAnsi="Arial" w:cs="Arial"/>
           <w:b/>
+          <w:bCs/>
           <w:sz w:val="24"/>
           <w:szCs w:val="24"/>
         </w:rPr>
@@ -222,15 +152,18 @@
         <w:rPr>
           <w:rFonts w:ascii="Arial" w:eastAsia="Arial Unicode MS" w:hAnsi="Arial" w:cs="Arial"/>
           <w:b/>
+          <w:bCs/>
           <w:sz w:val="24"/>
           <w:szCs w:val="24"/>
         </w:rPr>
         <w:t>CULA</w:t>
       </w:r>
-      <w:r>
-        <w:rPr>
-          <w:rFonts w:ascii="Arial" w:eastAsia="Arial Unicode MS" w:hAnsi="Arial" w:cs="Arial"/>
-          <w:b/>
+      <w:proofErr w:type="gramEnd"/>
+      <w:r>
+        <w:rPr>
+          <w:rFonts w:ascii="Arial" w:eastAsia="Arial Unicode MS" w:hAnsi="Arial" w:cs="Arial"/>
+          <w:b/>
+          <w:bCs/>
           <w:sz w:val="24"/>
           <w:szCs w:val="24"/>
         </w:rPr>
@@ -239,24 +172,16 @@
       <w:r>
         <w:rPr>
           <w:rFonts w:ascii="Arial" w:eastAsia="Arial Unicode MS" w:hAnsi="Arial" w:cs="Arial"/>
-          <w:b/>
-          <w:sz w:val="24"/>
-          <w:szCs w:val="24"/>
-        </w:rPr>
-        <w:t xml:space="preserve"> </w:t>
-      </w:r>
-      <w:r>
-        <w:rPr>
-          <w:rFonts w:ascii="Arial" w:eastAsia="Arial Unicode MS" w:hAnsi="Arial" w:cs="Arial"/>
-          <w:sz w:val="24"/>
-          <w:szCs w:val="24"/>
-        </w:rPr>
-        <w:t xml:space="preserve">CPF. N° </w:t>
-      </w:r>
-      <w:r>
-        <w:rPr>
-          <w:rFonts w:ascii="Arial" w:eastAsia="Arial Unicode MS" w:hAnsi="Arial" w:cs="Arial"/>
-          <w:b/>
+          <w:sz w:val="24"/>
+          <w:szCs w:val="24"/>
+        </w:rPr>
+        <w:t xml:space="preserve"> CPF. N° </w:t>
+      </w:r>
+      <w:r>
+        <w:rPr>
+          <w:rFonts w:ascii="Arial" w:eastAsia="Arial Unicode MS" w:hAnsi="Arial" w:cs="Arial"/>
+          <w:b/>
+          <w:bCs/>
           <w:sz w:val="24"/>
           <w:szCs w:val="24"/>
         </w:rPr>
@@ -274,6 +199,7 @@
         <w:rPr>
           <w:rFonts w:ascii="Arial" w:eastAsia="Arial Unicode MS" w:hAnsi="Arial" w:cs="Arial"/>
           <w:b/>
+          <w:bCs/>
           <w:sz w:val="24"/>
           <w:szCs w:val="24"/>
         </w:rPr>
@@ -284,16 +210,38 @@
         <w:rPr>
           <w:rFonts w:ascii="Arial" w:eastAsia="Arial Unicode MS" w:hAnsi="Arial" w:cs="Arial"/>
           <w:b/>
-          <w:sz w:val="24"/>
-          <w:szCs w:val="24"/>
-        </w:rPr>
-        <w:t>VINCULO</w:t>
+          <w:bCs/>
+          <w:sz w:val="24"/>
+          <w:szCs w:val="24"/>
+        </w:rPr>
+        <w:t>V</w:t>
+      </w:r>
+      <w:r>
+        <w:rPr>
+          <w:rFonts w:ascii="Arial" w:eastAsia="Arial Unicode MS" w:hAnsi="Arial" w:cs="Arial"/>
+          <w:b/>
+          <w:bCs/>
+          <w:sz w:val="24"/>
+          <w:szCs w:val="24"/>
+        </w:rPr>
+        <w:t>I</w:t>
+      </w:r>
+      <w:r>
+        <w:rPr>
+          <w:rFonts w:ascii="Arial" w:eastAsia="Arial Unicode MS" w:hAnsi="Arial" w:cs="Arial"/>
+          <w:b/>
+          <w:bCs/>
+          <w:sz w:val="24"/>
+          <w:szCs w:val="24"/>
+        </w:rPr>
+        <w:t>NCULO</w:t>
       </w:r>
       <w:proofErr w:type="gramEnd"/>
       <w:r>
         <w:rPr>
           <w:rFonts w:ascii="Arial" w:eastAsia="Arial Unicode MS" w:hAnsi="Arial" w:cs="Arial"/>
           <w:b/>
+          <w:bCs/>
           <w:sz w:val="24"/>
           <w:szCs w:val="24"/>
         </w:rPr>
@@ -302,55 +250,27 @@
       <w:r>
         <w:rPr>
           <w:rFonts w:ascii="Arial" w:eastAsia="Arial Unicode MS" w:hAnsi="Arial" w:cs="Arial"/>
-          <w:b/>
-          <w:sz w:val="24"/>
-          <w:szCs w:val="24"/>
-        </w:rPr>
-        <w:t xml:space="preserve"> </w:t>
-      </w:r>
-      <w:r>
-        <w:rPr>
-          <w:rFonts w:ascii="Arial" w:eastAsia="Arial Unicode MS" w:hAnsi="Arial" w:cs="Arial"/>
-          <w:sz w:val="24"/>
-          <w:szCs w:val="24"/>
-        </w:rPr>
-        <w:t xml:space="preserve">deste município recebendo atualmente uma remuneração </w:t>
-      </w:r>
-      <w:r>
-        <w:rPr>
-          <w:rFonts w:ascii="Arial" w:eastAsia="Arial Unicode MS" w:hAnsi="Arial" w:cs="Arial"/>
-          <w:bCs/>
-          <w:sz w:val="24"/>
-          <w:szCs w:val="24"/>
-        </w:rPr>
-        <w:t>de</w:t>
-      </w:r>
-      <w:r>
-        <w:rPr>
-          <w:rFonts w:ascii="Arial" w:eastAsia="Arial Unicode MS" w:hAnsi="Arial" w:cs="Arial"/>
-          <w:b/>
-          <w:sz w:val="24"/>
-          <w:szCs w:val="24"/>
-        </w:rPr>
-        <w:t xml:space="preserve"> R$</w:t>
-      </w:r>
-      <w:r>
-        <w:t xml:space="preserve"> </w:t>
-      </w:r>
-      <w:r>
-        <w:rPr>
-          <w:rFonts w:ascii="Arial" w:eastAsia="Arial Unicode MS" w:hAnsi="Arial" w:cs="Arial"/>
-          <w:b/>
-          <w:sz w:val="24"/>
-          <w:szCs w:val="24"/>
-        </w:rPr>
-        <w:t>{{</w:t>
+          <w:sz w:val="24"/>
+          <w:szCs w:val="24"/>
+        </w:rPr>
+        <w:t xml:space="preserve"> deste município recebendo atualmente uma remuneração de </w:t>
+      </w:r>
+      <w:r>
+        <w:rPr>
+          <w:rFonts w:ascii="Arial" w:eastAsia="Arial Unicode MS" w:hAnsi="Arial" w:cs="Arial"/>
+          <w:b/>
+          <w:bCs/>
+          <w:sz w:val="24"/>
+          <w:szCs w:val="24"/>
+        </w:rPr>
+        <w:t>R$ {{</w:t>
       </w:r>
       <w:proofErr w:type="gramStart"/>
       <w:r>
         <w:rPr>
           <w:rFonts w:ascii="Arial" w:eastAsia="Arial Unicode MS" w:hAnsi="Arial" w:cs="Arial"/>
           <w:b/>
+          <w:bCs/>
           <w:sz w:val="24"/>
           <w:szCs w:val="24"/>
         </w:rPr>
@@ -361,6 +281,7 @@
         <w:rPr>
           <w:rFonts w:ascii="Arial" w:eastAsia="Arial Unicode MS" w:hAnsi="Arial" w:cs="Arial"/>
           <w:b/>
+          <w:bCs/>
           <w:sz w:val="24"/>
           <w:szCs w:val="24"/>
         </w:rPr>
@@ -369,27 +290,10 @@
       <w:r>
         <w:rPr>
           <w:rFonts w:ascii="Arial" w:eastAsia="Arial Unicode MS" w:hAnsi="Arial" w:cs="Arial"/>
-          <w:b/>
-          <w:sz w:val="24"/>
-          <w:szCs w:val="24"/>
-        </w:rPr>
-        <w:t xml:space="preserve"> </w:t>
-      </w:r>
-      <w:r>
-        <w:rPr>
-          <w:rFonts w:ascii="Arial" w:eastAsia="Arial Unicode MS" w:hAnsi="Arial" w:cs="Arial"/>
-          <w:sz w:val="24"/>
-          <w:szCs w:val="24"/>
-        </w:rPr>
-        <w:t>(</w:t>
-      </w:r>
-      <w:r>
-        <w:rPr>
-          <w:rFonts w:ascii="Arial" w:eastAsia="Arial Unicode MS" w:hAnsi="Arial" w:cs="Arial"/>
-          <w:sz w:val="24"/>
-          <w:szCs w:val="24"/>
-        </w:rPr>
-        <w:t>{{</w:t>
+          <w:sz w:val="24"/>
+          <w:szCs w:val="24"/>
+        </w:rPr>
+        <w:t xml:space="preserve"> ({{</w:t>
       </w:r>
       <w:proofErr w:type="gramStart"/>
       <w:r>
@@ -407,160 +311,106 @@
           <w:sz w:val="24"/>
           <w:szCs w:val="24"/>
         </w:rPr>
-        <w:t>_EXT}}</w:t>
-      </w:r>
-      <w:r>
-        <w:rPr>
-          <w:rFonts w:ascii="Arial" w:eastAsia="Arial Unicode MS" w:hAnsi="Arial" w:cs="Arial"/>
-          <w:sz w:val="24"/>
-          <w:szCs w:val="24"/>
-        </w:rPr>
-        <w:t>)</w:t>
-      </w:r>
-      <w:r>
-        <w:rPr>
-          <w:rFonts w:ascii="Arial" w:eastAsia="Arial Unicode MS" w:hAnsi="Arial" w:cs="Arial"/>
-          <w:sz w:val="24"/>
-          <w:szCs w:val="24"/>
-        </w:rPr>
-        <w:t xml:space="preserve">. </w:t>
-      </w:r>
-      <w:r>
-        <w:rPr>
-          <w:rFonts w:ascii="Arial" w:eastAsia="Arial Unicode MS" w:hAnsi="Arial" w:cs="Arial"/>
+        <w:t xml:space="preserve">_EXT}}). </w:t>
+      </w:r>
+      <w:r>
+        <w:rPr>
+          <w:rFonts w:ascii="Arial" w:eastAsia="Arial Unicode MS" w:hAnsi="Arial" w:cs="Arial"/>
+          <w:sz w:val="24"/>
+          <w:szCs w:val="24"/>
+        </w:rPr>
+        <w:t xml:space="preserve">Gerando uma MARGEM CONSIGNÁVEL de </w:t>
+      </w:r>
+      <w:r>
+        <w:rPr>
+          <w:rFonts w:ascii="Arial" w:eastAsia="Arial Unicode MS" w:hAnsi="Arial" w:cs="Arial"/>
+          <w:b/>
+          <w:bCs/>
+          <w:sz w:val="24"/>
+          <w:szCs w:val="24"/>
+        </w:rPr>
+        <w:t>R$ {{MARGEM_TOTAL_NUM}}</w:t>
+      </w:r>
+      <w:r>
+        <w:rPr>
+          <w:rFonts w:ascii="Arial" w:eastAsia="Arial Unicode MS" w:hAnsi="Arial" w:cs="Arial"/>
+          <w:sz w:val="24"/>
+          <w:szCs w:val="24"/>
+        </w:rPr>
+        <w:t xml:space="preserve"> ({{MARGEM_TOTAL_EXT}}), com margem comprometida no valor de </w:t>
+      </w:r>
+      <w:r>
+        <w:rPr>
+          <w:rFonts w:ascii="Arial" w:eastAsia="Arial Unicode MS" w:hAnsi="Arial" w:cs="Arial"/>
+          <w:b/>
+          <w:bCs/>
+          <w:sz w:val="24"/>
+          <w:szCs w:val="24"/>
+        </w:rPr>
+        <w:t xml:space="preserve">R$ </w:t>
+      </w:r>
+      <w:r>
+        <w:rPr>
+          <w:rFonts w:ascii="Arial" w:eastAsia="Arial Unicode MS" w:hAnsi="Arial" w:cs="Arial"/>
+          <w:b/>
+          <w:bCs/>
           <w:sz w:val="24"/>
           <w:szCs w:val="24"/>
         </w:rPr>
         <w:t>{{CONSIGNADOS_LISTA}}</w:t>
       </w:r>
+      <w:r>
+        <w:rPr>
+          <w:rFonts w:ascii="Arial" w:eastAsia="Arial Unicode MS" w:hAnsi="Arial" w:cs="Arial"/>
+          <w:sz w:val="24"/>
+          <w:szCs w:val="24"/>
+        </w:rPr>
+        <w:t xml:space="preserve">, restando uma margem livre de R$ </w:t>
+      </w:r>
+      <w:r>
+        <w:rPr>
+          <w:rFonts w:ascii="Arial" w:eastAsia="Arial Unicode MS" w:hAnsi="Arial" w:cs="Arial"/>
+          <w:b/>
+          <w:bCs/>
+          <w:sz w:val="24"/>
+          <w:szCs w:val="24"/>
+        </w:rPr>
+        <w:t>{{MARGEM_LIVRE_NUM}}</w:t>
+      </w:r>
+      <w:r>
+        <w:rPr>
+          <w:rFonts w:ascii="Arial" w:eastAsia="Arial Unicode MS" w:hAnsi="Arial" w:cs="Arial"/>
+          <w:sz w:val="24"/>
+          <w:szCs w:val="24"/>
+        </w:rPr>
+        <w:t xml:space="preserve"> ({{MARGEM_LIVRE_EXT}}).</w:t>
+      </w:r>
     </w:p>
     <w:p>
       <w:pPr>
         <w:spacing w:line="360" w:lineRule="auto"/>
-        <w:ind w:firstLine="709"/>
         <w:jc w:val="both"/>
         <w:rPr>
+          <w:rFonts w:ascii="Arial" w:eastAsia="Arial Unicode MS" w:hAnsi="Arial" w:cs="Arial"/>
+          <w:sz w:val="24"/>
+          <w:szCs w:val="24"/>
+        </w:rPr>
+      </w:pPr>
+      <w:r>
+        <w:rPr>
+          <w:rFonts w:ascii="Arial" w:eastAsia="Arial Unicode MS" w:hAnsi="Arial" w:cs="Arial"/>
+          <w:sz w:val="24"/>
+          <w:szCs w:val="24"/>
+        </w:rPr>
+        <w:t xml:space="preserve">Solicitamos que o consignado </w:t>
+      </w:r>
+      <w:r>
+        <w:rPr>
           <w:rFonts w:ascii="Arial" w:hAnsi="Arial" w:cs="Arial"/>
-          <w:color w:val="000000"/>
-          <w:sz w:val="24"/>
-          <w:szCs w:val="24"/>
-        </w:rPr>
-      </w:pPr>
-      <w:r>
-        <w:rPr>
-          <w:rFonts w:ascii="Arial" w:hAnsi="Arial" w:cs="Arial"/>
-          <w:color w:val="000000"/>
-          <w:sz w:val="24"/>
-          <w:szCs w:val="24"/>
-        </w:rPr>
-        <w:t xml:space="preserve">Gerando uma MARGEM CONSIGNÁVEL de R$ </w:t>
-      </w:r>
-      <w:r>
-        <w:rPr>
-          <w:rFonts w:ascii="Arial" w:hAnsi="Arial" w:cs="Arial"/>
-          <w:b/>
-          <w:bCs/>
-          <w:color w:val="000000"/>
-          <w:sz w:val="24"/>
-          <w:szCs w:val="24"/>
-        </w:rPr>
-        <w:t>{{MARGEM_TOTAL_NUM}}</w:t>
-      </w:r>
-      <w:r>
-        <w:rPr>
-          <w:rFonts w:ascii="Arial" w:hAnsi="Arial" w:cs="Arial"/>
-          <w:color w:val="000000"/>
-          <w:sz w:val="24"/>
-          <w:szCs w:val="24"/>
-        </w:rPr>
-        <w:t xml:space="preserve"> ({{MARGEM_TOTAL_EXT}}), com margem comprometida no valor de</w:t>
-      </w:r>
-      <w:r>
-        <w:rPr>
-          <w:rFonts w:ascii="Arial" w:hAnsi="Arial" w:cs="Arial"/>
-          <w:b/>
-          <w:bCs/>
-          <w:color w:val="000000"/>
-          <w:sz w:val="24"/>
-          <w:szCs w:val="24"/>
-        </w:rPr>
-        <w:t xml:space="preserve"> R$ {{MARGEM_COMPROMETIDA_NUM}}</w:t>
-      </w:r>
-      <w:r>
-        <w:rPr>
-          <w:rFonts w:ascii="Arial" w:hAnsi="Arial" w:cs="Arial"/>
-          <w:color w:val="000000"/>
-          <w:sz w:val="24"/>
-          <w:szCs w:val="24"/>
-        </w:rPr>
-        <w:t xml:space="preserve"> ({{MARGEM_COMPROMETIDA_EXT}}), restando uma margem livre de </w:t>
-      </w:r>
-      <w:r>
-        <w:rPr>
-          <w:rFonts w:ascii="Arial" w:hAnsi="Arial" w:cs="Arial"/>
-          <w:b/>
-          <w:bCs/>
-          <w:color w:val="000000"/>
-          <w:sz w:val="24"/>
-          <w:szCs w:val="24"/>
-        </w:rPr>
-        <w:t>R$ {{MARGEM_LIVRE_NUM}}</w:t>
-      </w:r>
-      <w:r>
-        <w:rPr>
-          <w:rFonts w:ascii="Arial" w:hAnsi="Arial" w:cs="Arial"/>
-          <w:color w:val="000000"/>
-          <w:sz w:val="24"/>
-          <w:szCs w:val="24"/>
-        </w:rPr>
-        <w:t xml:space="preserve"> ({{MARGEM_LIVRE_EXT}}).</w:t>
-      </w:r>
-    </w:p>
-    <w:p>
-      <w:pPr>
-        <w:spacing w:line="360" w:lineRule="auto"/>
-        <w:ind w:firstLine="709"/>
-        <w:jc w:val="both"/>
-        <w:rPr>
-          <w:rFonts w:ascii="Arial" w:hAnsi="Arial" w:cs="Arial"/>
-          <w:color w:val="000000"/>
-          <w:sz w:val="24"/>
-          <w:szCs w:val="24"/>
-        </w:rPr>
-      </w:pPr>
-      <w:r>
-        <w:rPr>
-          <w:rFonts w:ascii="Arial" w:eastAsia="Arial Unicode MS" w:hAnsi="Arial" w:cs="Arial"/>
-          <w:sz w:val="24"/>
-          <w:szCs w:val="24"/>
-        </w:rPr>
-        <w:t xml:space="preserve">Solicitamos que o consignado </w:t>
-      </w:r>
-      <w:r>
-        <w:rPr>
-          <w:rFonts w:ascii="Arial" w:hAnsi="Arial" w:cs="Arial"/>
-          <w:b/>
-          <w:sz w:val="24"/>
-          <w:szCs w:val="24"/>
-        </w:rPr>
-        <w:t>nã</w:t>
-      </w:r>
-      <w:r>
-        <w:rPr>
-          <w:rFonts w:ascii="Arial" w:hAnsi="Arial" w:cs="Arial"/>
-          <w:b/>
-          <w:sz w:val="24"/>
-          <w:szCs w:val="24"/>
-        </w:rPr>
-        <w:t>o exceda 96 (noventa e seis) parcelas mensais e sucessivas</w:t>
-      </w:r>
-      <w:r>
-        <w:rPr>
-          <w:rFonts w:ascii="Arial" w:hAnsi="Arial" w:cs="Arial"/>
-          <w:sz w:val="24"/>
-          <w:szCs w:val="24"/>
-        </w:rPr>
-        <w:t>, conforma IN PRES/INSS Nº 181, DE 5 DE FEVEREIRO DE 2025.</w:t>
+          <w:sz w:val="24"/>
+          <w:szCs w:val="24"/>
+        </w:rPr>
+        <w:t>não exceda 96 (noventa e seis) parcelas mensais e sucessivas, conforma IN PRES/INSS Nº 181, DE 5 DE FEVEREIRO DE 2025.</w:t>
       </w:r>
     </w:p>
     <w:p>

</xml_diff>

<commit_message>
ajustes docx e código da tela principal
</commit_message>
<xml_diff>
--- a/DECLARAÇÃO_DE_MARGEM_MODELO.docx
+++ b/DECLARAÇÃO_DE_MARGEM_MODELO.docx
@@ -253,17 +253,17 @@
           <w:sz w:val="24"/>
           <w:szCs w:val="24"/>
         </w:rPr>
-        <w:t xml:space="preserve"> deste município recebendo atualmente uma remuneração de </w:t>
-      </w:r>
-      <w:r>
-        <w:rPr>
-          <w:rFonts w:ascii="Arial" w:eastAsia="Arial Unicode MS" w:hAnsi="Arial" w:cs="Arial"/>
-          <w:b/>
-          <w:bCs/>
-          <w:sz w:val="24"/>
-          <w:szCs w:val="24"/>
-        </w:rPr>
-        <w:t>R$ {{</w:t>
+        <w:t xml:space="preserve"> deste município recebendo atualmente uma remuneração de</w:t>
+      </w:r>
+      <w:r>
+        <w:rPr>
+          <w:rFonts w:ascii="Arial" w:eastAsia="Arial Unicode MS" w:hAnsi="Arial" w:cs="Arial"/>
+          <w:b/>
+          <w:bCs/>
+          <w:sz w:val="24"/>
+          <w:szCs w:val="24"/>
+        </w:rPr>
+        <w:t xml:space="preserve"> {{</w:t>
       </w:r>
       <w:proofErr w:type="gramStart"/>
       <w:r>
@@ -319,35 +319,35 @@
           <w:sz w:val="24"/>
           <w:szCs w:val="24"/>
         </w:rPr>
-        <w:t xml:space="preserve">Gerando uma MARGEM CONSIGNÁVEL de </w:t>
-      </w:r>
-      <w:r>
-        <w:rPr>
-          <w:rFonts w:ascii="Arial" w:eastAsia="Arial Unicode MS" w:hAnsi="Arial" w:cs="Arial"/>
-          <w:b/>
-          <w:bCs/>
-          <w:sz w:val="24"/>
-          <w:szCs w:val="24"/>
-        </w:rPr>
-        <w:t>R$ {{MARGEM_TOTAL_NUM}}</w:t>
-      </w:r>
-      <w:r>
-        <w:rPr>
-          <w:rFonts w:ascii="Arial" w:eastAsia="Arial Unicode MS" w:hAnsi="Arial" w:cs="Arial"/>
-          <w:sz w:val="24"/>
-          <w:szCs w:val="24"/>
-        </w:rPr>
-        <w:t xml:space="preserve"> ({{MARGEM_TOTAL_EXT}}), com margem comprometida no valor de </w:t>
-      </w:r>
-      <w:r>
-        <w:rPr>
-          <w:rFonts w:ascii="Arial" w:eastAsia="Arial Unicode MS" w:hAnsi="Arial" w:cs="Arial"/>
-          <w:b/>
-          <w:bCs/>
-          <w:sz w:val="24"/>
-          <w:szCs w:val="24"/>
-        </w:rPr>
-        <w:t xml:space="preserve">R$ </w:t>
+        <w:t>Gerando uma MARGEM CONSIGNÁVEL de</w:t>
+      </w:r>
+      <w:r>
+        <w:rPr>
+          <w:rFonts w:ascii="Arial" w:eastAsia="Arial Unicode MS" w:hAnsi="Arial" w:cs="Arial"/>
+          <w:b/>
+          <w:bCs/>
+          <w:sz w:val="24"/>
+          <w:szCs w:val="24"/>
+        </w:rPr>
+        <w:t xml:space="preserve"> {{MARGEM_TOTAL_NUM}}</w:t>
+      </w:r>
+      <w:r>
+        <w:rPr>
+          <w:rFonts w:ascii="Arial" w:eastAsia="Arial Unicode MS" w:hAnsi="Arial" w:cs="Arial"/>
+          <w:sz w:val="24"/>
+          <w:szCs w:val="24"/>
+        </w:rPr>
+        <w:t xml:space="preserve"> ({{MARGEM_TOTAL_EXT}}), com margem comprometida no valor de</w:t>
+      </w:r>
+      <w:r>
+        <w:rPr>
+          <w:rFonts w:ascii="Arial" w:eastAsia="Arial Unicode MS" w:hAnsi="Arial" w:cs="Arial"/>
+          <w:b/>
+          <w:bCs/>
+          <w:sz w:val="24"/>
+          <w:szCs w:val="24"/>
+        </w:rPr>
+        <w:t xml:space="preserve"> </w:t>
       </w:r>
       <w:r>
         <w:rPr>
@@ -1638,6 +1638,7 @@
   <w:style w:type="character" w:default="1" w:styleId="Fontepargpadro">
     <w:name w:val="Default Paragraph Font"/>
     <w:uiPriority w:val="1"/>
+    <w:semiHidden/>
     <w:unhideWhenUsed/>
   </w:style>
   <w:style w:type="table" w:default="1" w:styleId="Tabelanormal">

</xml_diff>

<commit_message>
ajustes para identificar f/m
</commit_message>
<xml_diff>
--- a/DECLARAÇÃO_DE_MARGEM_MODELO.docx
+++ b/DECLARAÇÃO_DE_MARGEM_MODELO.docx
@@ -97,7 +97,23 @@
           <w:sz w:val="24"/>
           <w:szCs w:val="24"/>
         </w:rPr>
-        <w:t xml:space="preserve">Declaramos para os devidos fins junto ao BANCO BRADESCO S/A Agência 1783-3 Carpina-PE, que a Sra. </w:t>
+        <w:t xml:space="preserve">Declaramos para os devidos fins junto ao BANCO BRADESCO S/A Agência 1783-3 Carpina-PE, que </w:t>
+      </w:r>
+      <w:r>
+        <w:rPr>
+          <w:rFonts w:ascii="Arial" w:eastAsia="Arial Unicode MS" w:hAnsi="Arial" w:cs="Arial"/>
+          <w:sz w:val="24"/>
+          <w:szCs w:val="24"/>
+        </w:rPr>
+        <w:t>{{TRATAMENTO}}</w:t>
+      </w:r>
+      <w:r>
+        <w:rPr>
+          <w:rFonts w:ascii="Arial" w:eastAsia="Arial Unicode MS" w:hAnsi="Arial" w:cs="Arial"/>
+          <w:sz w:val="24"/>
+          <w:szCs w:val="24"/>
+        </w:rPr>
+        <w:t xml:space="preserve">. </w:t>
       </w:r>
       <w:r>
         <w:rPr>
@@ -125,9 +141,8 @@
           <w:sz w:val="24"/>
           <w:szCs w:val="24"/>
         </w:rPr>
-        <w:t>{{</w:t>
-      </w:r>
-      <w:proofErr w:type="gramStart"/>
+        <w:t>{{MATR</w:t>
+      </w:r>
       <w:r>
         <w:rPr>
           <w:rFonts w:ascii="Arial" w:eastAsia="Arial Unicode MS" w:hAnsi="Arial" w:cs="Arial"/>
@@ -136,7 +151,7 @@
           <w:sz w:val="24"/>
           <w:szCs w:val="24"/>
         </w:rPr>
-        <w:t>MATR</w:t>
+        <w:t>I</w:t>
       </w:r>
       <w:r>
         <w:rPr>
@@ -146,6 +161,52 @@
           <w:sz w:val="24"/>
           <w:szCs w:val="24"/>
         </w:rPr>
+        <w:t>CULA}}</w:t>
+      </w:r>
+      <w:r>
+        <w:rPr>
+          <w:rFonts w:ascii="Arial" w:eastAsia="Arial Unicode MS" w:hAnsi="Arial" w:cs="Arial"/>
+          <w:sz w:val="24"/>
+          <w:szCs w:val="24"/>
+        </w:rPr>
+        <w:t xml:space="preserve"> CPF. N° </w:t>
+      </w:r>
+      <w:r>
+        <w:rPr>
+          <w:rFonts w:ascii="Arial" w:eastAsia="Arial Unicode MS" w:hAnsi="Arial" w:cs="Arial"/>
+          <w:b/>
+          <w:bCs/>
+          <w:sz w:val="24"/>
+          <w:szCs w:val="24"/>
+        </w:rPr>
+        <w:t>{{CPF}}</w:t>
+      </w:r>
+      <w:r>
+        <w:rPr>
+          <w:rFonts w:ascii="Arial" w:eastAsia="Arial Unicode MS" w:hAnsi="Arial" w:cs="Arial"/>
+          <w:sz w:val="24"/>
+          <w:szCs w:val="24"/>
+        </w:rPr>
+        <w:t xml:space="preserve">, é </w:t>
+      </w:r>
+      <w:r>
+        <w:rPr>
+          <w:rFonts w:ascii="Arial" w:eastAsia="Arial Unicode MS" w:hAnsi="Arial" w:cs="Arial"/>
+          <w:b/>
+          <w:bCs/>
+          <w:sz w:val="24"/>
+          <w:szCs w:val="24"/>
+        </w:rPr>
+        <w:t>{{V</w:t>
+      </w:r>
+      <w:r>
+        <w:rPr>
+          <w:rFonts w:ascii="Arial" w:eastAsia="Arial Unicode MS" w:hAnsi="Arial" w:cs="Arial"/>
+          <w:b/>
+          <w:bCs/>
+          <w:sz w:val="24"/>
+          <w:szCs w:val="24"/>
+        </w:rPr>
         <w:t>I</w:t>
       </w:r>
       <w:r>
@@ -156,9 +217,16 @@
           <w:sz w:val="24"/>
           <w:szCs w:val="24"/>
         </w:rPr>
-        <w:t>CULA</w:t>
-      </w:r>
-      <w:proofErr w:type="gramEnd"/>
+        <w:t>NCULO}}</w:t>
+      </w:r>
+      <w:r>
+        <w:rPr>
+          <w:rFonts w:ascii="Arial" w:eastAsia="Arial Unicode MS" w:hAnsi="Arial" w:cs="Arial"/>
+          <w:sz w:val="24"/>
+          <w:szCs w:val="24"/>
+        </w:rPr>
+        <w:t xml:space="preserve"> deste município recebendo atualmente uma remuneração de</w:t>
+      </w:r>
       <w:r>
         <w:rPr>
           <w:rFonts w:ascii="Arial" w:eastAsia="Arial Unicode MS" w:hAnsi="Arial" w:cs="Arial"/>
@@ -167,151 +235,15 @@
           <w:sz w:val="24"/>
           <w:szCs w:val="24"/>
         </w:rPr>
-        <w:t>}}</w:t>
-      </w:r>
-      <w:r>
-        <w:rPr>
-          <w:rFonts w:ascii="Arial" w:eastAsia="Arial Unicode MS" w:hAnsi="Arial" w:cs="Arial"/>
-          <w:sz w:val="24"/>
-          <w:szCs w:val="24"/>
-        </w:rPr>
-        <w:t xml:space="preserve"> CPF. N° </w:t>
-      </w:r>
-      <w:r>
-        <w:rPr>
-          <w:rFonts w:ascii="Arial" w:eastAsia="Arial Unicode MS" w:hAnsi="Arial" w:cs="Arial"/>
-          <w:b/>
-          <w:bCs/>
-          <w:sz w:val="24"/>
-          <w:szCs w:val="24"/>
-        </w:rPr>
-        <w:t>{{CPF}}</w:t>
-      </w:r>
-      <w:r>
-        <w:rPr>
-          <w:rFonts w:ascii="Arial" w:eastAsia="Arial Unicode MS" w:hAnsi="Arial" w:cs="Arial"/>
-          <w:sz w:val="24"/>
-          <w:szCs w:val="24"/>
-        </w:rPr>
-        <w:t xml:space="preserve">, é </w:t>
-      </w:r>
-      <w:r>
-        <w:rPr>
-          <w:rFonts w:ascii="Arial" w:eastAsia="Arial Unicode MS" w:hAnsi="Arial" w:cs="Arial"/>
-          <w:b/>
-          <w:bCs/>
-          <w:sz w:val="24"/>
-          <w:szCs w:val="24"/>
-        </w:rPr>
-        <w:t>{{</w:t>
-      </w:r>
-      <w:proofErr w:type="gramStart"/>
-      <w:r>
-        <w:rPr>
-          <w:rFonts w:ascii="Arial" w:eastAsia="Arial Unicode MS" w:hAnsi="Arial" w:cs="Arial"/>
-          <w:b/>
-          <w:bCs/>
-          <w:sz w:val="24"/>
-          <w:szCs w:val="24"/>
-        </w:rPr>
-        <w:t>V</w:t>
-      </w:r>
-      <w:r>
-        <w:rPr>
-          <w:rFonts w:ascii="Arial" w:eastAsia="Arial Unicode MS" w:hAnsi="Arial" w:cs="Arial"/>
-          <w:b/>
-          <w:bCs/>
-          <w:sz w:val="24"/>
-          <w:szCs w:val="24"/>
-        </w:rPr>
-        <w:t>I</w:t>
-      </w:r>
-      <w:r>
-        <w:rPr>
-          <w:rFonts w:ascii="Arial" w:eastAsia="Arial Unicode MS" w:hAnsi="Arial" w:cs="Arial"/>
-          <w:b/>
-          <w:bCs/>
-          <w:sz w:val="24"/>
-          <w:szCs w:val="24"/>
-        </w:rPr>
-        <w:t>NCULO</w:t>
-      </w:r>
-      <w:proofErr w:type="gramEnd"/>
-      <w:r>
-        <w:rPr>
-          <w:rFonts w:ascii="Arial" w:eastAsia="Arial Unicode MS" w:hAnsi="Arial" w:cs="Arial"/>
-          <w:b/>
-          <w:bCs/>
-          <w:sz w:val="24"/>
-          <w:szCs w:val="24"/>
-        </w:rPr>
-        <w:t>}}</w:t>
-      </w:r>
-      <w:r>
-        <w:rPr>
-          <w:rFonts w:ascii="Arial" w:eastAsia="Arial Unicode MS" w:hAnsi="Arial" w:cs="Arial"/>
-          <w:sz w:val="24"/>
-          <w:szCs w:val="24"/>
-        </w:rPr>
-        <w:t xml:space="preserve"> deste município recebendo atualmente uma remuneração de</w:t>
-      </w:r>
-      <w:r>
-        <w:rPr>
-          <w:rFonts w:ascii="Arial" w:eastAsia="Arial Unicode MS" w:hAnsi="Arial" w:cs="Arial"/>
-          <w:b/>
-          <w:bCs/>
-          <w:sz w:val="24"/>
-          <w:szCs w:val="24"/>
-        </w:rPr>
-        <w:t xml:space="preserve"> {{</w:t>
-      </w:r>
-      <w:proofErr w:type="gramStart"/>
-      <w:r>
-        <w:rPr>
-          <w:rFonts w:ascii="Arial" w:eastAsia="Arial Unicode MS" w:hAnsi="Arial" w:cs="Arial"/>
-          <w:b/>
-          <w:bCs/>
-          <w:sz w:val="24"/>
-          <w:szCs w:val="24"/>
-        </w:rPr>
-        <w:t>SALARIO</w:t>
-      </w:r>
-      <w:proofErr w:type="gramEnd"/>
-      <w:r>
-        <w:rPr>
-          <w:rFonts w:ascii="Arial" w:eastAsia="Arial Unicode MS" w:hAnsi="Arial" w:cs="Arial"/>
-          <w:b/>
-          <w:bCs/>
-          <w:sz w:val="24"/>
-          <w:szCs w:val="24"/>
-        </w:rPr>
-        <w:t>_NUM}}</w:t>
-      </w:r>
-      <w:r>
-        <w:rPr>
-          <w:rFonts w:ascii="Arial" w:eastAsia="Arial Unicode MS" w:hAnsi="Arial" w:cs="Arial"/>
-          <w:sz w:val="24"/>
-          <w:szCs w:val="24"/>
-        </w:rPr>
-        <w:t xml:space="preserve"> ({{</w:t>
-      </w:r>
-      <w:proofErr w:type="gramStart"/>
-      <w:r>
-        <w:rPr>
-          <w:rFonts w:ascii="Arial" w:eastAsia="Arial Unicode MS" w:hAnsi="Arial" w:cs="Arial"/>
-          <w:sz w:val="24"/>
-          <w:szCs w:val="24"/>
-        </w:rPr>
-        <w:t>SALARIO</w:t>
-      </w:r>
-      <w:proofErr w:type="gramEnd"/>
-      <w:r>
-        <w:rPr>
-          <w:rFonts w:ascii="Arial" w:eastAsia="Arial Unicode MS" w:hAnsi="Arial" w:cs="Arial"/>
-          <w:sz w:val="24"/>
-          <w:szCs w:val="24"/>
-        </w:rPr>
-        <w:t xml:space="preserve">_EXT}}). </w:t>
+        <w:t xml:space="preserve"> {{SALARIO_NUM}}</w:t>
+      </w:r>
+      <w:r>
+        <w:rPr>
+          <w:rFonts w:ascii="Arial" w:eastAsia="Arial Unicode MS" w:hAnsi="Arial" w:cs="Arial"/>
+          <w:sz w:val="24"/>
+          <w:szCs w:val="24"/>
+        </w:rPr>
+        <w:t xml:space="preserve"> ({{SALARIO_EXT}}). </w:t>
       </w:r>
       <w:r>
         <w:rPr>

</xml_diff>

<commit_message>
alterações: cor de fundo, input, e modelo de declaração
</commit_message>
<xml_diff>
--- a/DECLARAÇÃO_DE_MARGEM_MODELO.docx
+++ b/DECLARAÇÃO_DE_MARGEM_MODELO.docx
@@ -113,7 +113,7 @@
           <w:sz w:val="24"/>
           <w:szCs w:val="24"/>
         </w:rPr>
-        <w:t xml:space="preserve">. </w:t>
+        <w:t xml:space="preserve"> </w:t>
       </w:r>
       <w:r>
         <w:rPr>
@@ -197,8 +197,9 @@
           <w:sz w:val="24"/>
           <w:szCs w:val="24"/>
         </w:rPr>
-        <w:t>{{V</w:t>
-      </w:r>
+        <w:t>{{</w:t>
+      </w:r>
+      <w:proofErr w:type="gramStart"/>
       <w:r>
         <w:rPr>
           <w:rFonts w:ascii="Arial" w:eastAsia="Arial Unicode MS" w:hAnsi="Arial" w:cs="Arial"/>
@@ -207,6 +208,16 @@
           <w:sz w:val="24"/>
           <w:szCs w:val="24"/>
         </w:rPr>
+        <w:t>V</w:t>
+      </w:r>
+      <w:r>
+        <w:rPr>
+          <w:rFonts w:ascii="Arial" w:eastAsia="Arial Unicode MS" w:hAnsi="Arial" w:cs="Arial"/>
+          <w:b/>
+          <w:bCs/>
+          <w:sz w:val="24"/>
+          <w:szCs w:val="24"/>
+        </w:rPr>
         <w:t>I</w:t>
       </w:r>
       <w:r>
@@ -217,7 +228,18 @@
           <w:sz w:val="24"/>
           <w:szCs w:val="24"/>
         </w:rPr>
-        <w:t>NCULO}}</w:t>
+        <w:t>NCULO</w:t>
+      </w:r>
+      <w:proofErr w:type="gramEnd"/>
+      <w:r>
+        <w:rPr>
+          <w:rFonts w:ascii="Arial" w:eastAsia="Arial Unicode MS" w:hAnsi="Arial" w:cs="Arial"/>
+          <w:b/>
+          <w:bCs/>
+          <w:sz w:val="24"/>
+          <w:szCs w:val="24"/>
+        </w:rPr>
+        <w:t>}}</w:t>
       </w:r>
       <w:r>
         <w:rPr>
@@ -235,15 +257,55 @@
           <w:sz w:val="24"/>
           <w:szCs w:val="24"/>
         </w:rPr>
-        <w:t xml:space="preserve"> {{SALARIO_NUM}}</w:t>
-      </w:r>
-      <w:r>
-        <w:rPr>
-          <w:rFonts w:ascii="Arial" w:eastAsia="Arial Unicode MS" w:hAnsi="Arial" w:cs="Arial"/>
-          <w:sz w:val="24"/>
-          <w:szCs w:val="24"/>
-        </w:rPr>
-        <w:t xml:space="preserve"> ({{SALARIO_EXT}}). </w:t>
+        <w:t xml:space="preserve"> {{</w:t>
+      </w:r>
+      <w:proofErr w:type="gramStart"/>
+      <w:r>
+        <w:rPr>
+          <w:rFonts w:ascii="Arial" w:eastAsia="Arial Unicode MS" w:hAnsi="Arial" w:cs="Arial"/>
+          <w:b/>
+          <w:bCs/>
+          <w:sz w:val="24"/>
+          <w:szCs w:val="24"/>
+        </w:rPr>
+        <w:t>SALARIO</w:t>
+      </w:r>
+      <w:proofErr w:type="gramEnd"/>
+      <w:r>
+        <w:rPr>
+          <w:rFonts w:ascii="Arial" w:eastAsia="Arial Unicode MS" w:hAnsi="Arial" w:cs="Arial"/>
+          <w:b/>
+          <w:bCs/>
+          <w:sz w:val="24"/>
+          <w:szCs w:val="24"/>
+        </w:rPr>
+        <w:t>_NUM}}</w:t>
+      </w:r>
+      <w:r>
+        <w:rPr>
+          <w:rFonts w:ascii="Arial" w:eastAsia="Arial Unicode MS" w:hAnsi="Arial" w:cs="Arial"/>
+          <w:sz w:val="24"/>
+          <w:szCs w:val="24"/>
+        </w:rPr>
+        <w:t xml:space="preserve"> ({{</w:t>
+      </w:r>
+      <w:proofErr w:type="gramStart"/>
+      <w:r>
+        <w:rPr>
+          <w:rFonts w:ascii="Arial" w:eastAsia="Arial Unicode MS" w:hAnsi="Arial" w:cs="Arial"/>
+          <w:sz w:val="24"/>
+          <w:szCs w:val="24"/>
+        </w:rPr>
+        <w:t>SALARIO</w:t>
+      </w:r>
+      <w:proofErr w:type="gramEnd"/>
+      <w:r>
+        <w:rPr>
+          <w:rFonts w:ascii="Arial" w:eastAsia="Arial Unicode MS" w:hAnsi="Arial" w:cs="Arial"/>
+          <w:sz w:val="24"/>
+          <w:szCs w:val="24"/>
+        </w:rPr>
+        <w:t xml:space="preserve">_EXT}}). </w:t>
       </w:r>
       <w:r>
         <w:rPr>

</xml_diff>

<commit_message>
ajuste estrutura docx e código final
</commit_message>
<xml_diff>
--- a/DECLARAÇÃO_DE_MARGEM_MODELO.docx
+++ b/DECLARAÇÃO_DE_MARGEM_MODELO.docx
@@ -359,7 +359,15 @@
           <w:sz w:val="24"/>
           <w:szCs w:val="24"/>
         </w:rPr>
-        <w:t xml:space="preserve">, restando uma margem livre de R$ </w:t>
+        <w:t>, restando uma margem livre de</w:t>
+      </w:r>
+      <w:r>
+        <w:rPr>
+          <w:rFonts w:ascii="Arial" w:eastAsia="Arial Unicode MS" w:hAnsi="Arial" w:cs="Arial"/>
+          <w:sz w:val="24"/>
+          <w:szCs w:val="24"/>
+        </w:rPr>
+        <w:t xml:space="preserve"> </w:t>
       </w:r>
       <w:r>
         <w:rPr>

</xml_diff>